<commit_message>
feat: implement booking and coaching workflow updates
Co-Authored-By: Oz <oz-agent@warp.dev>
</commit_message>
<xml_diff>
--- a/documentation/coaching_module.docx
+++ b/documentation/coaching_module.docx
@@ -322,7 +322,19 @@
         <w:rPr>
           <w:b/>
         </w:rPr>
-        <w:t>10. PIP Technical Architecture</w:t>
+        <w:t xml:space="preserve">10. </w:t>
+      </w:r>
+      <w:r>
+        <w:rPr>
+          <w:b/>
+        </w:rPr>
+        <w:t>ARTES</w:t>
+      </w:r>
+      <w:r>
+        <w:rPr>
+          <w:b/>
+        </w:rPr>
+        <w:t xml:space="preserve"> Technical Architecture</w:t>
       </w:r>
     </w:p>
     <w:p>
@@ -362,7 +374,13 @@
         <w:spacing w:after="40"/>
       </w:pPr>
       <w:r>
-        <w:t xml:space="preserve">   10.5 Integration with Existing PIP Modules</w:t>
+        <w:t xml:space="preserve">   10.5 Integration with Existing </w:t>
+      </w:r>
+      <w:r>
+        <w:t>ARTES</w:t>
+      </w:r>
+      <w:r>
+        <w:t xml:space="preserve"> Modules</w:t>
       </w:r>
     </w:p>
     <w:p>
@@ -420,12 +438,30 @@
     </w:p>
     <w:p>
       <w:r>
-        <w:t>The Coaching Module extends the People Intelligence Platform (PIP) to serve individual professional coaches and coaching practices as first-class tenants. Each coach is provisioned as their own organization, with their coachees onboarded as users. This architecture leverages PIP's existing multi-tenancy, billing, role-based access, and AI infrastructure while adding coaching-specific workflows: engagement lifecycle management, session documentation, between-session engagement, ICF-compliant hour logging, sponsor reporting, and practice management.</w:t>
-      </w:r>
-    </w:p>
-    <w:p>
-      <w:r>
-        <w:t>This document serves as both a theoretical reference for the coaching profession and a technical specification for implementing the module within PIP. It covers the procedural realities of how coaches work, the theoretical models that underpin their practice, and the detailed data models, API endpoints, and UI components required to support them.</w:t>
+        <w:t>The Coaching Module extends the People Intelligence Platform (</w:t>
+      </w:r>
+      <w:r>
+        <w:t>ARTES</w:t>
+      </w:r>
+      <w:r>
+        <w:t xml:space="preserve">) to serve individual professional coaches and coaching practices as first-class tenants. Each coach is provisioned as their own organization, with their coachees onboarded as users. This architecture leverages </w:t>
+      </w:r>
+      <w:r>
+        <w:t>ARTES</w:t>
+      </w:r>
+      <w:r>
+        <w:t>'s existing multi-tenancy, billing, role-based access, and AI infrastructure while adding coaching-specific workflows: engagement lifecycle management, session documentation, between-session engagement, ICF-compliant hour logging, sponsor reporting, and practice management.</w:t>
+      </w:r>
+    </w:p>
+    <w:p>
+      <w:r>
+        <w:t xml:space="preserve">This document serves as both a theoretical reference for the coaching profession and a technical specification for implementing the module within </w:t>
+      </w:r>
+      <w:r>
+        <w:t>ARTES</w:t>
+      </w:r>
+      <w:r>
+        <w:t>. It covers the procedural realities of how coaches work, the theoretical models that underpin their practice, and the detailed data models, API endpoints, and UI components required to support them.</w:t>
       </w:r>
     </w:p>
     <w:p>
@@ -461,7 +497,13 @@
         <w:t xml:space="preserve">Goal: </w:t>
       </w:r>
       <w:r>
-        <w:t>What does the coachee want to achieve? Goals should be SMART (Specific, Measurable, Achievable, Relevant, Time-bound). In PIP, this maps to the IDP's goal field.</w:t>
+        <w:t xml:space="preserve">What does the coachee want to achieve? Goals should be SMART (Specific, Measurable, Achievable, Relevant, Time-bound). In </w:t>
+      </w:r>
+      <w:r>
+        <w:t>ARTES</w:t>
+      </w:r>
+      <w:r>
+        <w:t>, this maps to the IDP's goal field.</w:t>
       </w:r>
     </w:p>
     <w:p>
@@ -476,7 +518,13 @@
         <w:t xml:space="preserve">Reality: </w:t>
       </w:r>
       <w:r>
-        <w:t>What is the current situation? This involves honest assessment of where the coachee stands today — their strengths, obstacles, resources, and constraints. PIP captures this via the currentReality field and baseline assessment scores (EQ-i, 360, etc.).</w:t>
+        <w:t xml:space="preserve">What is the current situation? This involves honest assessment of where the coachee stands today — their strengths, obstacles, resources, and constraints. </w:t>
+      </w:r>
+      <w:r>
+        <w:t>ARTES</w:t>
+      </w:r>
+      <w:r>
+        <w:t xml:space="preserve"> captures this via the currentReality field and baseline assessment scores (EQ-i, 360, etc.).</w:t>
       </w:r>
     </w:p>
     <w:p>
@@ -491,7 +539,13 @@
         <w:t xml:space="preserve">Options: </w:t>
       </w:r>
       <w:r>
-        <w:t>What could the coachee do? Brainstorming multiple strategies without judgment. PIP stores 4-6 development strategies generated by AI or collaboratively in session.</w:t>
+        <w:t xml:space="preserve">What could the coachee do? Brainstorming multiple strategies without judgment. </w:t>
+      </w:r>
+      <w:r>
+        <w:t>ARTES</w:t>
+      </w:r>
+      <w:r>
+        <w:t xml:space="preserve"> stores 4-6 development strategies generated by AI or collaboratively in session.</w:t>
       </w:r>
     </w:p>
     <w:p>
@@ -506,12 +560,21 @@
         <w:t xml:space="preserve">Will / Way Forward: </w:t>
       </w:r>
       <w:r>
-        <w:t>What will the coachee commit to? Specific actions with timelines and accountability. PIP maps this to willDoActions and milestones with due dates.</w:t>
-      </w:r>
-    </w:p>
-    <w:p>
-      <w:r>
-        <w:t>PIP already implements GROW as the backbone of IDP generation. The Coaching Module extends this by making GROW the conversational framework for every session, with session notes tagged to GROW phases and AI-generated session prep aligned to the model.</w:t>
+        <w:t xml:space="preserve">What will the coachee commit to? Specific actions with timelines and accountability. </w:t>
+      </w:r>
+      <w:r>
+        <w:t>ARTES</w:t>
+      </w:r>
+      <w:r>
+        <w:t xml:space="preserve"> maps this to willDoActions and milestones with due dates.</w:t>
+      </w:r>
+    </w:p>
+    <w:p>
+      <w:r>
+        <w:t>ARTES</w:t>
+      </w:r>
+      <w:r>
+        <w:t xml:space="preserve"> already implements GROW as the backbone of IDP generation. The Coaching Module extends this by making GROW the conversational framework for every session, with session notes tagged to GROW phases and AI-generated session prep aligned to the model.</w:t>
       </w:r>
     </w:p>
     <w:p>
@@ -1318,7 +1381,10 @@
     <w:p/>
     <w:p>
       <w:r>
-        <w:t>PIP's Coaching Module should allow coaches to tag sessions with the framework(s) used. This supports professional development reflection and ICF competency demonstration.</w:t>
+        <w:t>ARTES</w:t>
+      </w:r>
+      <w:r>
+        <w:t>'s Coaching Module should allow coaches to tag sessions with the framework(s) used. This supports professional development reflection and ICF competency demonstration.</w:t>
       </w:r>
     </w:p>
     <w:p>
@@ -1408,7 +1474,13 @@
               <w:rPr>
                 <w:sz w:val="20"/>
               </w:rPr>
-              <w:t>PIP Integration</w:t>
+              <w:t>ARTES</w:t>
+            </w:r>
+            <w:r>
+              <w:rPr>
+                <w:sz w:val="20"/>
+              </w:rPr>
+              <w:t xml:space="preserve"> Integration</w:t>
             </w:r>
           </w:p>
         </w:tc>
@@ -1542,7 +1614,19 @@
               <w:rPr>
                 <w:sz w:val="20"/>
               </w:rPr>
-              <w:t>Native via PIP survey engine — high value</w:t>
+              <w:t xml:space="preserve">Native via </w:t>
+            </w:r>
+            <w:r>
+              <w:rPr>
+                <w:sz w:val="20"/>
+              </w:rPr>
+              <w:t>ARTES</w:t>
+            </w:r>
+            <w:r>
+              <w:rPr>
+                <w:sz w:val="20"/>
+              </w:rPr>
+              <w:t xml:space="preserve"> survey engine — high value</w:t>
             </w:r>
           </w:p>
         </w:tc>
@@ -2011,7 +2095,19 @@
               <w:rPr>
                 <w:sz w:val="20"/>
               </w:rPr>
-              <w:t>Already supported in PIP survey engine</w:t>
+              <w:t xml:space="preserve">Already supported in </w:t>
+            </w:r>
+            <w:r>
+              <w:rPr>
+                <w:sz w:val="20"/>
+              </w:rPr>
+              <w:t>ARTES</w:t>
+            </w:r>
+            <w:r>
+              <w:rPr>
+                <w:sz w:val="20"/>
+              </w:rPr>
+              <w:t xml:space="preserve"> survey engine</w:t>
             </w:r>
           </w:p>
         </w:tc>
@@ -2078,8 +2174,83 @@
               <w:rPr>
                 <w:sz w:val="20"/>
               </w:rPr>
-              <w:t>Already supported in PIP survey engine</w:t>
-            </w:r>
+              <w:t xml:space="preserve">Already supported in </w:t>
+            </w:r>
+            <w:r>
+              <w:rPr>
+                <w:sz w:val="20"/>
+              </w:rPr>
+              <w:t>ARTES</w:t>
+            </w:r>
+            <w:r>
+              <w:rPr>
+                <w:sz w:val="20"/>
+              </w:rPr>
+              <w:t xml:space="preserve"> survey engine</w:t>
+            </w:r>
+          </w:p>
+        </w:tc>
+      </w:tr>
+      <w:tr>
+        <w:trPr>
+          <w:cnfStyle w:val="000000100000" w:firstRow="0" w:lastRow="0" w:firstColumn="0" w:lastColumn="0" w:oddVBand="0" w:evenVBand="0" w:oddHBand="1" w:evenHBand="0" w:firstRowFirstColumn="0" w:firstRowLastColumn="0" w:lastRowFirstColumn="0" w:lastRowLastColumn="0"/>
+        </w:trPr>
+        <w:tc>
+          <w:tcPr>
+            <w:cnfStyle w:val="001000000000" w:firstRow="0" w:lastRow="0" w:firstColumn="1" w:lastColumn="0" w:oddVBand="0" w:evenVBand="0" w:oddHBand="0" w:evenHBand="0" w:firstRowFirstColumn="0" w:firstRowLastColumn="0" w:lastRowFirstColumn="0" w:lastRowLastColumn="0"/>
+            <w:tcW w:w="2351" w:type="dxa"/>
+          </w:tcPr>
+          <w:p>
+            <w:pPr>
+              <w:rPr>
+                <w:sz w:val="20"/>
+              </w:rPr>
+            </w:pPr>
+            <w:r>
+              <w:rPr>
+                <w:sz w:val="20"/>
+              </w:rPr>
+              <w:t>LUMINA SPARK</w:t>
+            </w:r>
+          </w:p>
+        </w:tc>
+        <w:tc>
+          <w:tcPr>
+            <w:tcW w:w="2351" w:type="dxa"/>
+          </w:tcPr>
+          <w:p>
+            <w:pPr>
+              <w:cnfStyle w:val="000000100000" w:firstRow="0" w:lastRow="0" w:firstColumn="0" w:lastColumn="0" w:oddVBand="0" w:evenVBand="0" w:oddHBand="1" w:evenHBand="0" w:firstRowFirstColumn="0" w:firstRowLastColumn="0" w:lastRowFirstColumn="0" w:lastRowLastColumn="0"/>
+              <w:rPr>
+                <w:sz w:val="20"/>
+              </w:rPr>
+            </w:pPr>
+          </w:p>
+        </w:tc>
+        <w:tc>
+          <w:tcPr>
+            <w:tcW w:w="2351" w:type="dxa"/>
+          </w:tcPr>
+          <w:p>
+            <w:pPr>
+              <w:cnfStyle w:val="000000100000" w:firstRow="0" w:lastRow="0" w:firstColumn="0" w:lastColumn="0" w:oddVBand="0" w:evenVBand="0" w:oddHBand="1" w:evenHBand="0" w:firstRowFirstColumn="0" w:firstRowLastColumn="0" w:lastRowFirstColumn="0" w:lastRowLastColumn="0"/>
+              <w:rPr>
+                <w:sz w:val="20"/>
+              </w:rPr>
+            </w:pPr>
+          </w:p>
+        </w:tc>
+        <w:tc>
+          <w:tcPr>
+            <w:tcW w:w="2351" w:type="dxa"/>
+          </w:tcPr>
+          <w:p>
+            <w:pPr>
+              <w:cnfStyle w:val="000000100000" w:firstRow="0" w:lastRow="0" w:firstColumn="0" w:lastColumn="0" w:oddVBand="0" w:evenVBand="0" w:oddHBand="1" w:evenHBand="0" w:firstRowFirstColumn="0" w:firstRowLastColumn="0" w:lastRowFirstColumn="0" w:lastRowLastColumn="0"/>
+              <w:rPr>
+                <w:sz w:val="20"/>
+              </w:rPr>
+            </w:pPr>
           </w:p>
         </w:tc>
       </w:tr>
@@ -2087,8 +2258,19 @@
     <w:p/>
     <w:p>
       <w:r>
-        <w:lastRenderedPageBreak/>
-        <w:t>Design principle: Most instruments are proprietary and administered externally. PIP should provide a generic AssessmentRecord model (type, date, scores as flexible JSON, optional file attachment for PDF reports) rather than building instrument-specific integrations. The EQ-i integration already in PIP's IDP generation is the template for this approach.</w:t>
+        <w:t xml:space="preserve">Design principle: Most instruments are proprietary and administered externally. </w:t>
+      </w:r>
+      <w:r>
+        <w:t>ARTES</w:t>
+      </w:r>
+      <w:r>
+        <w:t xml:space="preserve"> should provide a generic AssessmentRecord model (type, date, scores as flexible JSON, optional file attachment for PDF reports) rather than building instrument-specific integrations. The EQ-i integration already in </w:t>
+      </w:r>
+      <w:r>
+        <w:t>ARTES</w:t>
+      </w:r>
+      <w:r>
+        <w:t>'s IDP generation is the template for this approach.</w:t>
       </w:r>
     </w:p>
     <w:p>
@@ -2141,7 +2323,10 @@
         <w:ind w:left="720"/>
       </w:pPr>
       <w:r>
-        <w:t>PIP feature: Prospect status on engagement record; optional notes from chemistry call</w:t>
+        <w:t>ARTES</w:t>
+      </w:r>
+      <w:r>
+        <w:t xml:space="preserve"> feature: Prospect status on engagement record; optional notes from chemistry call</w:t>
       </w:r>
     </w:p>
     <w:p>
@@ -2162,8 +2347,25 @@
         <w:pStyle w:val="ListBullet"/>
         <w:ind w:left="720"/>
       </w:pPr>
-      <w:r>
-        <w:t>Coaching agreement: scope, duration, frequency, format (video/phone/in-person), cancellation policy</w:t>
+      <w:commentRangeStart w:id="0"/>
+      <w:r>
+        <w:rPr>
+          <w:b/>
+          <w:bCs/>
+        </w:rPr>
+        <w:t>Coaching agreement</w:t>
+      </w:r>
+      <w:commentRangeEnd w:id="0"/>
+      <w:r>
+        <w:rPr>
+          <w:rStyle w:val="CommentReference"/>
+          <w:sz w:val="22"/>
+          <w:szCs w:val="22"/>
+        </w:rPr>
+        <w:commentReference w:id="0"/>
+      </w:r>
+      <w:r>
+        <w:t>: scope, duration, frequency, format (video/phone/in-person), cancellation policy</w:t>
       </w:r>
     </w:p>
     <w:p>
@@ -2199,7 +2401,10 @@
         <w:ind w:left="720"/>
       </w:pPr>
       <w:r>
-        <w:t>PIP features: Engagement record creation, sponsor contact info, session package tracking, document upload for signed contracts</w:t>
+        <w:t>ARTES</w:t>
+      </w:r>
+      <w:r>
+        <w:t xml:space="preserve"> features: Engagement record creation, sponsor contact info, session package tracking, document upload for signed contracts</w:t>
       </w:r>
     </w:p>
     <w:p>
@@ -2230,6 +2435,7 @@
         <w:ind w:left="720"/>
       </w:pPr>
       <w:r>
+        <w:lastRenderedPageBreak/>
         <w:t>Informal assessment: Coach interview using structured intake templates</w:t>
       </w:r>
     </w:p>
@@ -2239,7 +2445,6 @@
         <w:ind w:left="720"/>
       </w:pPr>
       <w:r>
-        <w:lastRenderedPageBreak/>
         <w:t>Self-assessment: Coachee rates themselves on relevant competencies</w:t>
       </w:r>
     </w:p>
@@ -2258,7 +2463,16 @@
         <w:ind w:left="720"/>
       </w:pPr>
       <w:r>
-        <w:t>PIP features: AssessmentRecord storage, PIP survey engine for 360/intake, link to existing coach interview flow</w:t>
+        <w:t>ARTES</w:t>
+      </w:r>
+      <w:r>
+        <w:t xml:space="preserve"> features: AssessmentRecord storage, </w:t>
+      </w:r>
+      <w:r>
+        <w:t>ARTES</w:t>
+      </w:r>
+      <w:r>
+        <w:t xml:space="preserve"> survey engine for 360/intake, link to existing coach interview flow</w:t>
       </w:r>
     </w:p>
     <w:p>
@@ -2298,7 +2512,10 @@
         <w:ind w:left="720"/>
       </w:pPr>
       <w:r>
-        <w:t>PIP feature: Existing AI-powered IDP generation with GROW model — already built</w:t>
+        <w:t>ARTES</w:t>
+      </w:r>
+      <w:r>
+        <w:t xml:space="preserve"> feature: Existing AI-powered IDP generation with GROW model — already built</w:t>
       </w:r>
     </w:p>
     <w:p>
@@ -2347,7 +2564,10 @@
         <w:ind w:left="720"/>
       </w:pPr>
       <w:r>
-        <w:t>PIP features: Session model (detailed in Section 4), action item tracking, reflection journal, AI session prep</w:t>
+        <w:t>ARTES</w:t>
+      </w:r>
+      <w:r>
+        <w:t xml:space="preserve"> features: Session model (detailed in Section 4), action item tracking, reflection journal, AI session prep</w:t>
       </w:r>
     </w:p>
     <w:p>
@@ -2396,7 +2616,10 @@
         <w:ind w:left="720"/>
       </w:pPr>
       <w:r>
-        <w:t>PIP feature: AI-drafted sponsor report from session data, manual review/edit before sharing</w:t>
+        <w:t>ARTES</w:t>
+      </w:r>
+      <w:r>
+        <w:t xml:space="preserve"> feature: AI-drafted sponsor report from session data, manual review/edit before sharing</w:t>
       </w:r>
     </w:p>
     <w:p>
@@ -2427,6 +2650,7 @@
         <w:ind w:left="720"/>
       </w:pPr>
       <w:r>
+        <w:lastRenderedPageBreak/>
         <w:t>Final report: comprehensive summary of goals, progress, pre/post scores, recommendations</w:t>
       </w:r>
     </w:p>
@@ -2436,7 +2660,6 @@
         <w:ind w:left="720"/>
       </w:pPr>
       <w:r>
-        <w:lastRenderedPageBreak/>
         <w:t>Transition plan: what the coachee will continue doing independently</w:t>
       </w:r>
     </w:p>
@@ -2455,7 +2678,10 @@
         <w:ind w:left="720"/>
       </w:pPr>
       <w:r>
-        <w:t>PIP features: Pre/post assessment comparison, AI-generated final report, engagement status -&gt; Completed</w:t>
+        <w:t>ARTES</w:t>
+      </w:r>
+      <w:r>
+        <w:t xml:space="preserve"> features: Pre/post assessment comparison, AI-generated final report, engagement status -&gt; Completed</w:t>
       </w:r>
     </w:p>
     <w:p>
@@ -2486,7 +2712,13 @@
         <w:ind w:left="720"/>
       </w:pPr>
       <w:r>
-        <w:t>Alumni status in PIP: read-only access to their IDP, assessments, and session summaries</w:t>
+        <w:t xml:space="preserve">Alumni status in </w:t>
+      </w:r>
+      <w:r>
+        <w:t>ARTES</w:t>
+      </w:r>
+      <w:r>
+        <w:t>: read-only access to their IDP, assessments, and session summaries</w:t>
       </w:r>
     </w:p>
     <w:p>
@@ -2893,6 +3125,7 @@
               <w:rPr>
                 <w:sz w:val="20"/>
               </w:rPr>
+              <w:lastRenderedPageBreak/>
               <w:t>Coach Notes (Private)</w:t>
             </w:r>
           </w:p>
@@ -2925,14 +3158,7 @@
               <w:rPr>
                 <w:sz w:val="20"/>
               </w:rPr>
-              <w:t xml:space="preserve">Coach observations, hypotheses, patterns noticed — NEVER shared </w:t>
-            </w:r>
-            <w:r>
-              <w:rPr>
-                <w:sz w:val="20"/>
-              </w:rPr>
-              <w:lastRenderedPageBreak/>
-              <w:t>with coachee</w:t>
+              <w:t>Coach observations, hypotheses, patterns noticed — NEVER shared with coachee</w:t>
             </w:r>
           </w:p>
         </w:tc>
@@ -2951,7 +3177,6 @@
               <w:rPr>
                 <w:sz w:val="20"/>
               </w:rPr>
-              <w:lastRenderedPageBreak/>
               <w:t>Shared Notes</w:t>
             </w:r>
           </w:p>
@@ -3286,7 +3511,13 @@
     </w:p>
     <w:p>
       <w:r>
-        <w:t>Coaches use a variety of psychometric instruments. Most are proprietary and administered through external platforms. PIP stores results generically rather than replicating each tool.</w:t>
+        <w:t xml:space="preserve">Coaches use a variety of psychometric instruments. Most are proprietary and administered through external platforms. </w:t>
+      </w:r>
+      <w:r>
+        <w:t>ARTES</w:t>
+      </w:r>
+      <w:r>
+        <w:t xml:space="preserve"> stores results generically rather than replicating each tool.</w:t>
       </w:r>
     </w:p>
     <w:p>
@@ -3350,7 +3581,13 @@
     </w:p>
     <w:p>
       <w:r>
-        <w:t>For 360 feedback, PIP's existing survey engine is a natural fit. A 360 template can be created with rater categories (self, manager, peer, direct report) and distributed via the existing survey link mechanism. Results aggregate into a multi-rater report that feeds into IDP goal setting.</w:t>
+        <w:t xml:space="preserve">For 360 feedback, </w:t>
+      </w:r>
+      <w:r>
+        <w:t>ARTES</w:t>
+      </w:r>
+      <w:r>
+        <w:t>'s existing survey engine is a natural fit. A 360 template can be created with rater categories (self, manager, peer, direct report) and distributed via the existing survey link mechanism. Results aggregate into a multi-rater report that feeds into IDP goal setting.</w:t>
       </w:r>
     </w:p>
     <w:p>
@@ -3363,7 +3600,13 @@
     </w:p>
     <w:p>
       <w:r>
-        <w:t>For coaches operating as independent practitioners, PIP serves as their practice management platform. Key features beyond session management:</w:t>
+        <w:t xml:space="preserve">For coaches operating as independent practitioners, </w:t>
+      </w:r>
+      <w:r>
+        <w:t>ARTES</w:t>
+      </w:r>
+      <w:r>
+        <w:t xml:space="preserve"> serves as their practice management platform. Key features beyond session management:</w:t>
       </w:r>
     </w:p>
     <w:p>
@@ -3482,7 +3725,19 @@
               <w:rPr>
                 <w:sz w:val="20"/>
               </w:rPr>
-              <w:t>None (not yet a PIP user)</w:t>
+              <w:t xml:space="preserve">None (not yet a </w:t>
+            </w:r>
+            <w:r>
+              <w:rPr>
+                <w:sz w:val="20"/>
+              </w:rPr>
+              <w:t>ARTES</w:t>
+            </w:r>
+            <w:r>
+              <w:rPr>
+                <w:sz w:val="20"/>
+              </w:rPr>
+              <w:t xml:space="preserve"> user)</w:t>
             </w:r>
           </w:p>
         </w:tc>
@@ -4479,7 +4734,13 @@
       </w:pPr>
       <w:r>
         <w:lastRenderedPageBreak/>
-        <w:t>8.2 PIP Hour Logging Features</w:t>
+        <w:t xml:space="preserve">8.2 </w:t>
+      </w:r>
+      <w:r>
+        <w:t>ARTES</w:t>
+      </w:r>
+      <w:r>
+        <w:t xml:space="preserve"> Hour Logging Features</w:t>
       </w:r>
     </w:p>
     <w:p>
@@ -4497,7 +4758,13 @@
         <w:ind w:left="720"/>
       </w:pPr>
       <w:r>
-        <w:t>Manual entry for coaching hours outside PIP (external clients)</w:t>
+        <w:t xml:space="preserve">Manual entry for coaching hours outside </w:t>
+      </w:r>
+      <w:r>
+        <w:t>ARTES</w:t>
+      </w:r>
+      <w:r>
+        <w:t xml:space="preserve"> (external clients)</w:t>
       </w:r>
     </w:p>
     <w:p>
@@ -4555,7 +4822,10 @@
     </w:p>
     <w:p>
       <w:r>
-        <w:t>PIP's existing Claude API integration (ai.service.ts with callClaude, 3-retry backoff, structured JSON output) serves as the foundation for coaching-specific AI features.</w:t>
+        <w:t>ARTES</w:t>
+      </w:r>
+      <w:r>
+        <w:t>'s existing Claude API integration (ai.service.ts with callClaude, 3-retry backoff, structured JSON output) serves as the foundation for coaching-specific AI features.</w:t>
       </w:r>
     </w:p>
     <w:tbl>
@@ -5210,7 +5480,13 @@
         <w:pStyle w:val="Heading1"/>
       </w:pPr>
       <w:r>
-        <w:t>10. PIP Technical Architecture</w:t>
+        <w:t xml:space="preserve">10. </w:t>
+      </w:r>
+      <w:r>
+        <w:t>ARTES</w:t>
+      </w:r>
+      <w:r>
+        <w:t xml:space="preserve"> Technical Architecture</w:t>
       </w:r>
     </w:p>
     <w:p>
@@ -5223,7 +5499,13 @@
     </w:p>
     <w:p>
       <w:r>
-        <w:t>Each individual coach is provisioned as a PIP Organization. Their coachees are Users with role "coachee". The coach themselves is the org admin (or a dedicated "coach_owner" role). This leverages existing multi-tenancy (organizationId filtering, tenant middleware) without architectural changes.</w:t>
+        <w:t xml:space="preserve">Each individual coach is provisioned as a </w:t>
+      </w:r>
+      <w:r>
+        <w:t>ARTES</w:t>
+      </w:r>
+      <w:r>
+        <w:t xml:space="preserve"> Organization. Their coachees are Users with role "coachee". The coach themselves is the org admin (or a dedicated "coach_owner" role). This leverages existing multi-tenancy (organizationId filtering, tenant middleware) without architectural changes.</w:t>
       </w:r>
     </w:p>
     <w:p>
@@ -9124,7 +9406,19 @@
               <w:rPr>
                 <w:sz w:val="20"/>
               </w:rPr>
-              <w:t>Link to PIP engagement (null for external)</w:t>
+              <w:t xml:space="preserve">Link to </w:t>
+            </w:r>
+            <w:r>
+              <w:rPr>
+                <w:sz w:val="20"/>
+              </w:rPr>
+              <w:t>ARTES</w:t>
+            </w:r>
+            <w:r>
+              <w:rPr>
+                <w:sz w:val="20"/>
+              </w:rPr>
+              <w:t xml:space="preserve"> engagement (null for external)</w:t>
             </w:r>
           </w:p>
         </w:tc>
@@ -9175,7 +9469,19 @@
               <w:rPr>
                 <w:sz w:val="20"/>
               </w:rPr>
-              <w:t>Link to PIP session (null for external)</w:t>
+              <w:t xml:space="preserve">Link to </w:t>
+            </w:r>
+            <w:r>
+              <w:rPr>
+                <w:sz w:val="20"/>
+              </w:rPr>
+              <w:t>ARTES</w:t>
+            </w:r>
+            <w:r>
+              <w:rPr>
+                <w:sz w:val="20"/>
+              </w:rPr>
+              <w:t xml:space="preserve"> session (null for external)</w:t>
             </w:r>
           </w:p>
         </w:tc>
@@ -9277,7 +9583,19 @@
               <w:rPr>
                 <w:sz w:val="20"/>
               </w:rPr>
-              <w:t>True if created from a PIP session, false if manual entry</w:t>
+              <w:t xml:space="preserve">True if created from a </w:t>
+            </w:r>
+            <w:r>
+              <w:rPr>
+                <w:sz w:val="20"/>
+              </w:rPr>
+              <w:t>ARTES</w:t>
+            </w:r>
+            <w:r>
+              <w:rPr>
+                <w:sz w:val="20"/>
+              </w:rPr>
+              <w:t xml:space="preserve"> session, false if manual entry</w:t>
             </w:r>
           </w:p>
         </w:tc>
@@ -11565,7 +11883,13 @@
         <w:pStyle w:val="Heading2"/>
       </w:pPr>
       <w:r>
-        <w:t>10.5 Integration with Existing PIP Modules</w:t>
+        <w:t xml:space="preserve">10.5 Integration with Existing </w:t>
+      </w:r>
+      <w:r>
+        <w:t>ARTES</w:t>
+      </w:r>
+      <w:r>
+        <w:t xml:space="preserve"> Modules</w:t>
       </w:r>
     </w:p>
     <w:tbl>
@@ -11592,7 +11916,13 @@
               <w:rPr>
                 <w:sz w:val="20"/>
               </w:rPr>
-              <w:t>PIP Module</w:t>
+              <w:t>ARTES</w:t>
+            </w:r>
+            <w:r>
+              <w:rPr>
+                <w:sz w:val="20"/>
+              </w:rPr>
+              <w:t xml:space="preserve"> Module</w:t>
             </w:r>
           </w:p>
         </w:tc>
@@ -11912,7 +12242,13 @@
     </w:p>
     <w:p>
       <w:r>
-        <w:t>Coachees access a simplified portal focused on their coaching journey. They should never see the full PIP admin interface. The portal includes:</w:t>
+        <w:t xml:space="preserve">Coachees access a simplified portal focused on their coaching journey. They should never see the full </w:t>
+      </w:r>
+      <w:r>
+        <w:t>ARTES</w:t>
+      </w:r>
+      <w:r>
+        <w:t xml:space="preserve"> admin interface. The portal includes:</w:t>
       </w:r>
     </w:p>
     <w:p>
@@ -12853,7 +13189,13 @@
         <w:ind w:left="720"/>
       </w:pPr>
       <w:r>
-        <w:t>Indigenous organizations and First Nations may be tax-exempt (PIP supports this via Organization.taxExempt flag)</w:t>
+        <w:t>Indigenous organizations and First Nations may be tax-exempt (</w:t>
+      </w:r>
+      <w:r>
+        <w:t>ARTES</w:t>
+      </w:r>
+      <w:r>
+        <w:t xml:space="preserve"> supports this via Organization.taxExempt flag)</w:t>
       </w:r>
     </w:p>
     <w:p>
@@ -12880,7 +13222,10 @@
         <w:ind w:left="720"/>
       </w:pPr>
       <w:r>
-        <w:t>PIP auto-calculates Canadian tax from organization billing address province (see tax-rates.ts)</w:t>
+        <w:t>ARTES</w:t>
+      </w:r>
+      <w:r>
+        <w:t xml:space="preserve"> auto-calculates Canadian tax from organization billing address province (see tax-rates.ts)</w:t>
       </w:r>
     </w:p>
     <w:p/>
@@ -12904,6 +13249,48 @@
     </w:sectPr>
   </w:body>
 </w:document>
+</file>
+
+<file path=word/comments.xml><?xml version="1.0" encoding="utf-8"?>
+<w:comments xmlns:wpc="http://schemas.microsoft.com/office/word/2010/wordprocessingCanvas" xmlns:cx="http://schemas.microsoft.com/office/drawing/2014/chartex" xmlns:cx1="http://schemas.microsoft.com/office/drawing/2015/9/8/chartex" xmlns:cx2="http://schemas.microsoft.com/office/drawing/2015/10/21/chartex" xmlns:cx3="http://schemas.microsoft.com/office/drawing/2016/5/9/chartex" xmlns:cx4="http://schemas.microsoft.com/office/drawing/2016/5/10/chartex" xmlns:cx5="http://schemas.microsoft.com/office/drawing/2016/5/11/chartex" xmlns:cx6="http://schemas.microsoft.com/office/drawing/2016/5/12/chartex" xmlns:cx7="http://schemas.microsoft.com/office/drawing/2016/5/13/chartex" xmlns:cx8="http://schemas.microsoft.com/office/drawing/2016/5/14/chartex" xmlns:mc="http://schemas.openxmlformats.org/markup-compatibility/2006" xmlns:aink="http://schemas.microsoft.com/office/drawing/2016/ink" xmlns:am3d="http://schemas.microsoft.com/office/drawing/2017/model3d" xmlns:o="urn:schemas-microsoft-com:office:office" xmlns:oel="http://schemas.microsoft.com/office/2019/extlst" xmlns:r="http://schemas.openxmlformats.org/officeDocument/2006/relationships" xmlns:m="http://schemas.openxmlformats.org/officeDocument/2006/math" xmlns:v="urn:schemas-microsoft-com:vml" xmlns:wp14="http://schemas.microsoft.com/office/word/2010/wordprocessingDrawing" xmlns:wp="http://schemas.openxmlformats.org/drawingml/2006/wordprocessingDrawing" xmlns:w10="urn:schemas-microsoft-com:office:word" xmlns:w="http://schemas.openxmlformats.org/wordprocessingml/2006/main" xmlns:w14="http://schemas.microsoft.com/office/word/2010/wordml" xmlns:w15="http://schemas.microsoft.com/office/word/2012/wordml" xmlns:w16cex="http://schemas.microsoft.com/office/word/2018/wordml/cex" xmlns:w16cid="http://schemas.microsoft.com/office/word/2016/wordml/cid" xmlns:w16="http://schemas.microsoft.com/office/word/2018/wordml" xmlns:w16du="http://schemas.microsoft.com/office/word/2023/wordml/word16du" xmlns:w16sdtdh="http://schemas.microsoft.com/office/word/2020/wordml/sdtdatahash" xmlns:w16sdtfl="http://schemas.microsoft.com/office/word/2024/wordml/sdtformatlock" xmlns:w16se="http://schemas.microsoft.com/office/word/2015/wordml/symex" xmlns:wpg="http://schemas.microsoft.com/office/word/2010/wordprocessingGroup" xmlns:wpi="http://schemas.microsoft.com/office/word/2010/wordprocessingInk" xmlns:wne="http://schemas.microsoft.com/office/word/2006/wordml" xmlns:wps="http://schemas.microsoft.com/office/word/2010/wordprocessingShape" mc:Ignorable="w14 w15 w16se w16cid w16 w16cex w16sdtdh w16sdtfl w16du wp14">
+  <w:comment w:id="0" w:author="Marek Hlavenka" w:date="2026-04-10T17:19:00Z" w:initials="MH">
+    <w:p>
+      <w:pPr>
+        <w:pStyle w:val="CommentText"/>
+      </w:pPr>
+      <w:r>
+        <w:rPr>
+          <w:rStyle w:val="CommentReference"/>
+        </w:rPr>
+        <w:annotationRef/>
+      </w:r>
+      <w:r>
+        <w:rPr>
+          <w:lang w:val="en-CA"/>
+        </w:rPr>
+        <w:t>Create default template, upload own or support electronic signing of the agreement in the app</w:t>
+      </w:r>
+    </w:p>
+  </w:comment>
+</w:comments>
+</file>
+
+<file path=word/commentsExtended.xml><?xml version="1.0" encoding="utf-8"?>
+<w15:commentsEx xmlns:wpc="http://schemas.microsoft.com/office/word/2010/wordprocessingCanvas" xmlns:cx="http://schemas.microsoft.com/office/drawing/2014/chartex" xmlns:cx1="http://schemas.microsoft.com/office/drawing/2015/9/8/chartex" xmlns:cx2="http://schemas.microsoft.com/office/drawing/2015/10/21/chartex" xmlns:cx3="http://schemas.microsoft.com/office/drawing/2016/5/9/chartex" xmlns:cx4="http://schemas.microsoft.com/office/drawing/2016/5/10/chartex" xmlns:cx5="http://schemas.microsoft.com/office/drawing/2016/5/11/chartex" xmlns:cx6="http://schemas.microsoft.com/office/drawing/2016/5/12/chartex" xmlns:cx7="http://schemas.microsoft.com/office/drawing/2016/5/13/chartex" xmlns:cx8="http://schemas.microsoft.com/office/drawing/2016/5/14/chartex" xmlns:mc="http://schemas.openxmlformats.org/markup-compatibility/2006" xmlns:aink="http://schemas.microsoft.com/office/drawing/2016/ink" xmlns:am3d="http://schemas.microsoft.com/office/drawing/2017/model3d" xmlns:o="urn:schemas-microsoft-com:office:office" xmlns:oel="http://schemas.microsoft.com/office/2019/extlst" xmlns:r="http://schemas.openxmlformats.org/officeDocument/2006/relationships" xmlns:m="http://schemas.openxmlformats.org/officeDocument/2006/math" xmlns:v="urn:schemas-microsoft-com:vml" xmlns:wp14="http://schemas.microsoft.com/office/word/2010/wordprocessingDrawing" xmlns:wp="http://schemas.openxmlformats.org/drawingml/2006/wordprocessingDrawing" xmlns:w10="urn:schemas-microsoft-com:office:word" xmlns:w="http://schemas.openxmlformats.org/wordprocessingml/2006/main" xmlns:w14="http://schemas.microsoft.com/office/word/2010/wordml" xmlns:w15="http://schemas.microsoft.com/office/word/2012/wordml" xmlns:w16cex="http://schemas.microsoft.com/office/word/2018/wordml/cex" xmlns:w16cid="http://schemas.microsoft.com/office/word/2016/wordml/cid" xmlns:w16="http://schemas.microsoft.com/office/word/2018/wordml" xmlns:w16du="http://schemas.microsoft.com/office/word/2023/wordml/word16du" xmlns:w16sdtdh="http://schemas.microsoft.com/office/word/2020/wordml/sdtdatahash" xmlns:w16sdtfl="http://schemas.microsoft.com/office/word/2024/wordml/sdtformatlock" xmlns:w16se="http://schemas.microsoft.com/office/word/2015/wordml/symex" xmlns:wpg="http://schemas.microsoft.com/office/word/2010/wordprocessingGroup" xmlns:wpi="http://schemas.microsoft.com/office/word/2010/wordprocessingInk" xmlns:wne="http://schemas.microsoft.com/office/word/2006/wordml" xmlns:wps="http://schemas.microsoft.com/office/word/2010/wordprocessingShape" mc:Ignorable="w14 w15 w16se w16cid w16 w16cex w16sdtdh w16sdtfl w16du wp14">
+  <w15:commentEx w15:paraId="5FBCA0B0" w15:done="0"/>
+</w15:commentsEx>
+</file>
+
+<file path=word/commentsExtensible.xml><?xml version="1.0" encoding="utf-8"?>
+<w16cex:commentsExtensible xmlns:wpc="http://schemas.microsoft.com/office/word/2010/wordprocessingCanvas" xmlns:cx="http://schemas.microsoft.com/office/drawing/2014/chartex" xmlns:cx1="http://schemas.microsoft.com/office/drawing/2015/9/8/chartex" xmlns:cx2="http://schemas.microsoft.com/office/drawing/2015/10/21/chartex" xmlns:cx3="http://schemas.microsoft.com/office/drawing/2016/5/9/chartex" xmlns:cx4="http://schemas.microsoft.com/office/drawing/2016/5/10/chartex" xmlns:cx5="http://schemas.microsoft.com/office/drawing/2016/5/11/chartex" xmlns:cx6="http://schemas.microsoft.com/office/drawing/2016/5/12/chartex" xmlns:cx7="http://schemas.microsoft.com/office/drawing/2016/5/13/chartex" xmlns:cx8="http://schemas.microsoft.com/office/drawing/2016/5/14/chartex" xmlns:cr="http://schemas.microsoft.com/office/comments/2020/reactions" xmlns:mc="http://schemas.openxmlformats.org/markup-compatibility/2006" xmlns:aink="http://schemas.microsoft.com/office/drawing/2016/ink" xmlns:am3d="http://schemas.microsoft.com/office/drawing/2017/model3d" xmlns:o="urn:schemas-microsoft-com:office:office" xmlns:oel="http://schemas.microsoft.com/office/2019/extlst" xmlns:r="http://schemas.openxmlformats.org/officeDocument/2006/relationships" xmlns:m="http://schemas.openxmlformats.org/officeDocument/2006/math" xmlns:v="urn:schemas-microsoft-com:vml" xmlns:wp14="http://schemas.microsoft.com/office/word/2010/wordprocessingDrawing" xmlns:wp="http://schemas.openxmlformats.org/drawingml/2006/wordprocessingDrawing" xmlns:w10="urn:schemas-microsoft-com:office:word" xmlns:w="http://schemas.openxmlformats.org/wordprocessingml/2006/main" xmlns:w14="http://schemas.microsoft.com/office/word/2010/wordml" xmlns:w15="http://schemas.microsoft.com/office/word/2012/wordml" xmlns:w16cex="http://schemas.microsoft.com/office/word/2018/wordml/cex" xmlns:w16cid="http://schemas.microsoft.com/office/word/2016/wordml/cid" xmlns:w16="http://schemas.microsoft.com/office/word/2018/wordml" xmlns:w16du="http://schemas.microsoft.com/office/word/2023/wordml/word16du" xmlns:w16sdtdh="http://schemas.microsoft.com/office/word/2020/wordml/sdtdatahash" xmlns:w16sdtfl="http://schemas.microsoft.com/office/word/2024/wordml/sdtformatlock" xmlns:w16se="http://schemas.microsoft.com/office/word/2015/wordml/symex" xmlns:wpg="http://schemas.microsoft.com/office/word/2010/wordprocessingGroup" xmlns:wpi="http://schemas.microsoft.com/office/word/2010/wordprocessingInk" xmlns:wne="http://schemas.microsoft.com/office/word/2006/wordml" xmlns:wps="http://schemas.microsoft.com/office/word/2010/wordprocessingShape" mc:Ignorable="w14 w15 w16se w16cid w16 w16cex w16sdtdh w16sdtfl cr w16du wp14">
+  <w16cex:commentExtensible w16cex:durableId="19A00CCB" w16cex:dateUtc="2026-04-10T21:19:00Z"/>
+</w16cex:commentsExtensible>
+</file>
+
+<file path=word/commentsIds.xml><?xml version="1.0" encoding="utf-8"?>
+<w16cid:commentsIds xmlns:wpc="http://schemas.microsoft.com/office/word/2010/wordprocessingCanvas" xmlns:cx="http://schemas.microsoft.com/office/drawing/2014/chartex" xmlns:cx1="http://schemas.microsoft.com/office/drawing/2015/9/8/chartex" xmlns:cx2="http://schemas.microsoft.com/office/drawing/2015/10/21/chartex" xmlns:cx3="http://schemas.microsoft.com/office/drawing/2016/5/9/chartex" xmlns:cx4="http://schemas.microsoft.com/office/drawing/2016/5/10/chartex" xmlns:cx5="http://schemas.microsoft.com/office/drawing/2016/5/11/chartex" xmlns:cx6="http://schemas.microsoft.com/office/drawing/2016/5/12/chartex" xmlns:cx7="http://schemas.microsoft.com/office/drawing/2016/5/13/chartex" xmlns:cx8="http://schemas.microsoft.com/office/drawing/2016/5/14/chartex" xmlns:mc="http://schemas.openxmlformats.org/markup-compatibility/2006" xmlns:aink="http://schemas.microsoft.com/office/drawing/2016/ink" xmlns:am3d="http://schemas.microsoft.com/office/drawing/2017/model3d" xmlns:o="urn:schemas-microsoft-com:office:office" xmlns:oel="http://schemas.microsoft.com/office/2019/extlst" xmlns:r="http://schemas.openxmlformats.org/officeDocument/2006/relationships" xmlns:m="http://schemas.openxmlformats.org/officeDocument/2006/math" xmlns:v="urn:schemas-microsoft-com:vml" xmlns:wp14="http://schemas.microsoft.com/office/word/2010/wordprocessingDrawing" xmlns:wp="http://schemas.openxmlformats.org/drawingml/2006/wordprocessingDrawing" xmlns:w10="urn:schemas-microsoft-com:office:word" xmlns:w="http://schemas.openxmlformats.org/wordprocessingml/2006/main" xmlns:w14="http://schemas.microsoft.com/office/word/2010/wordml" xmlns:w15="http://schemas.microsoft.com/office/word/2012/wordml" xmlns:w16cex="http://schemas.microsoft.com/office/word/2018/wordml/cex" xmlns:w16cid="http://schemas.microsoft.com/office/word/2016/wordml/cid" xmlns:w16="http://schemas.microsoft.com/office/word/2018/wordml" xmlns:w16du="http://schemas.microsoft.com/office/word/2023/wordml/word16du" xmlns:w16sdtdh="http://schemas.microsoft.com/office/word/2020/wordml/sdtdatahash" xmlns:w16sdtfl="http://schemas.microsoft.com/office/word/2024/wordml/sdtformatlock" xmlns:w16se="http://schemas.microsoft.com/office/word/2015/wordml/symex" xmlns:wpg="http://schemas.microsoft.com/office/word/2010/wordprocessingGroup" xmlns:wpi="http://schemas.microsoft.com/office/word/2010/wordprocessingInk" xmlns:wne="http://schemas.microsoft.com/office/word/2006/wordml" xmlns:wps="http://schemas.microsoft.com/office/word/2010/wordprocessingShape" mc:Ignorable="w14 w15 w16se w16cid w16 w16cex w16sdtdh w16sdtfl w16du wp14">
+  <w16cid:commentId w16cid:paraId="5FBCA0B0" w16cid:durableId="19A00CCB"/>
+</w16cid:commentsIds>
 </file>
 
 <file path=word/numbering.xml><?xml version="1.0" encoding="utf-8"?>
@@ -13107,6 +13494,14 @@
     <w:abstractNumId w:val="0"/>
   </w:num>
 </w:numbering>
+</file>
+
+<file path=word/people.xml><?xml version="1.0" encoding="utf-8"?>
+<w15:people xmlns:wpc="http://schemas.microsoft.com/office/word/2010/wordprocessingCanvas" xmlns:cx="http://schemas.microsoft.com/office/drawing/2014/chartex" xmlns:cx1="http://schemas.microsoft.com/office/drawing/2015/9/8/chartex" xmlns:cx2="http://schemas.microsoft.com/office/drawing/2015/10/21/chartex" xmlns:cx3="http://schemas.microsoft.com/office/drawing/2016/5/9/chartex" xmlns:cx4="http://schemas.microsoft.com/office/drawing/2016/5/10/chartex" xmlns:cx5="http://schemas.microsoft.com/office/drawing/2016/5/11/chartex" xmlns:cx6="http://schemas.microsoft.com/office/drawing/2016/5/12/chartex" xmlns:cx7="http://schemas.microsoft.com/office/drawing/2016/5/13/chartex" xmlns:cx8="http://schemas.microsoft.com/office/drawing/2016/5/14/chartex" xmlns:mc="http://schemas.openxmlformats.org/markup-compatibility/2006" xmlns:aink="http://schemas.microsoft.com/office/drawing/2016/ink" xmlns:am3d="http://schemas.microsoft.com/office/drawing/2017/model3d" xmlns:o="urn:schemas-microsoft-com:office:office" xmlns:oel="http://schemas.microsoft.com/office/2019/extlst" xmlns:r="http://schemas.openxmlformats.org/officeDocument/2006/relationships" xmlns:m="http://schemas.openxmlformats.org/officeDocument/2006/math" xmlns:v="urn:schemas-microsoft-com:vml" xmlns:wp14="http://schemas.microsoft.com/office/word/2010/wordprocessingDrawing" xmlns:wp="http://schemas.openxmlformats.org/drawingml/2006/wordprocessingDrawing" xmlns:w10="urn:schemas-microsoft-com:office:word" xmlns:w="http://schemas.openxmlformats.org/wordprocessingml/2006/main" xmlns:w14="http://schemas.microsoft.com/office/word/2010/wordml" xmlns:w15="http://schemas.microsoft.com/office/word/2012/wordml" xmlns:w16cex="http://schemas.microsoft.com/office/word/2018/wordml/cex" xmlns:w16cid="http://schemas.microsoft.com/office/word/2016/wordml/cid" xmlns:w16="http://schemas.microsoft.com/office/word/2018/wordml" xmlns:w16du="http://schemas.microsoft.com/office/word/2023/wordml/word16du" xmlns:w16sdtdh="http://schemas.microsoft.com/office/word/2020/wordml/sdtdatahash" xmlns:w16sdtfl="http://schemas.microsoft.com/office/word/2024/wordml/sdtformatlock" xmlns:w16se="http://schemas.microsoft.com/office/word/2015/wordml/symex" xmlns:wpg="http://schemas.microsoft.com/office/word/2010/wordprocessingGroup" xmlns:wpi="http://schemas.microsoft.com/office/word/2010/wordprocessingInk" xmlns:wne="http://schemas.microsoft.com/office/word/2006/wordml" xmlns:wps="http://schemas.microsoft.com/office/word/2010/wordprocessingShape" mc:Ignorable="w14 w15 w16se w16cid w16 w16cex w16sdtdh w16sdtfl w16du wp14">
+  <w15:person w15:author="Marek Hlavenka">
+    <w15:presenceInfo w15:providerId="Windows Live" w15:userId="e768a8ec8e4d5360"/>
+  </w15:person>
+</w15:people>
 </file>
 
 <file path=word/styles.xml><?xml version="1.0" encoding="utf-8"?>
@@ -24488,6 +24883,76 @@
       </w:tcPr>
     </w:tblStylePr>
   </w:style>
+  <w:style w:type="character" w:styleId="CommentReference">
+    <w:name w:val="annotation reference"/>
+    <w:basedOn w:val="DefaultParagraphFont"/>
+    <w:uiPriority w:val="99"/>
+    <w:semiHidden/>
+    <w:unhideWhenUsed/>
+    <w:rsid w:val="005B0C6A"/>
+    <w:rPr>
+      <w:sz w:val="16"/>
+      <w:szCs w:val="16"/>
+    </w:rPr>
+  </w:style>
+  <w:style w:type="paragraph" w:styleId="CommentText">
+    <w:name w:val="annotation text"/>
+    <w:basedOn w:val="Normal"/>
+    <w:link w:val="CommentTextChar"/>
+    <w:uiPriority w:val="99"/>
+    <w:unhideWhenUsed/>
+    <w:rsid w:val="005B0C6A"/>
+    <w:pPr>
+      <w:spacing w:line="240" w:lineRule="auto"/>
+    </w:pPr>
+    <w:rPr>
+      <w:sz w:val="20"/>
+      <w:szCs w:val="20"/>
+    </w:rPr>
+  </w:style>
+  <w:style w:type="character" w:customStyle="1" w:styleId="CommentTextChar">
+    <w:name w:val="Comment Text Char"/>
+    <w:basedOn w:val="DefaultParagraphFont"/>
+    <w:link w:val="CommentText"/>
+    <w:uiPriority w:val="99"/>
+    <w:rsid w:val="005B0C6A"/>
+    <w:rPr>
+      <w:rFonts w:ascii="Calibri" w:hAnsi="Calibri"/>
+      <w:color w:val="333333"/>
+      <w:sz w:val="20"/>
+      <w:szCs w:val="20"/>
+    </w:rPr>
+  </w:style>
+  <w:style w:type="paragraph" w:styleId="CommentSubject">
+    <w:name w:val="annotation subject"/>
+    <w:basedOn w:val="CommentText"/>
+    <w:next w:val="CommentText"/>
+    <w:link w:val="CommentSubjectChar"/>
+    <w:uiPriority w:val="99"/>
+    <w:semiHidden/>
+    <w:unhideWhenUsed/>
+    <w:rsid w:val="005B0C6A"/>
+    <w:rPr>
+      <w:b/>
+      <w:bCs/>
+    </w:rPr>
+  </w:style>
+  <w:style w:type="character" w:customStyle="1" w:styleId="CommentSubjectChar">
+    <w:name w:val="Comment Subject Char"/>
+    <w:basedOn w:val="CommentTextChar"/>
+    <w:link w:val="CommentSubject"/>
+    <w:uiPriority w:val="99"/>
+    <w:semiHidden/>
+    <w:rsid w:val="005B0C6A"/>
+    <w:rPr>
+      <w:rFonts w:ascii="Calibri" w:hAnsi="Calibri"/>
+      <w:b/>
+      <w:bCs/>
+      <w:color w:val="333333"/>
+      <w:sz w:val="20"/>
+      <w:szCs w:val="20"/>
+    </w:rPr>
+  </w:style>
 </w:styles>
 </file>
 

</xml_diff>

<commit_message>
docs(coaching): record April 2026 implementation status + open roadmap
Extends the coaching module reference with two new sections: what has
actually shipped (data models, journal, booking, sponsor billing,
coachee portal, trial feature, tests) and what remains outstanding
against the original spec (AssessmentRecord, ICF hour logging, sponsor
AI reports, check-in pulses, alumni follow-up, session-framework
tagging, practice dashboard polish).

Co-Authored-By: Claude Opus 4.6 (1M context) <noreply@anthropic.com>
</commit_message>
<xml_diff>
--- a/documentation/coaching_module.docx
+++ b/documentation/coaching_module.docx
@@ -421,10 +421,23 @@
         <w:spacing w:after="40"/>
       </w:pPr>
       <w:r>
-        <w:rPr>
-          <w:b/>
-        </w:rPr>
-        <w:t>14. Appendix: Canadian Tax Considerations for Coaching Services</w:t>
+        <w:t>14. Implementation Status (April 2026)</w:t>
+      </w:r>
+    </w:p>
+    <w:p>
+      <w:pPr>
+        <w:spacing w:after="40"/>
+      </w:pPr>
+      <w:r>
+        <w:t>15. Outstanding Work &amp; Roadmap Gaps</w:t>
+      </w:r>
+    </w:p>
+    <w:p>
+      <w:pPr>
+        <w:spacing w:after="40"/>
+      </w:pPr>
+      <w:r>
+        <w:t>16. Appendix: Canadian Tax Considerations for Coaching Services</w:t>
       </w:r>
     </w:p>
     <w:p/>
@@ -571,10 +584,7 @@
     </w:p>
     <w:p>
       <w:r>
-        <w:t>ARTES</w:t>
-      </w:r>
-      <w:r>
-        <w:t xml:space="preserve"> already implements GROW as the backbone of IDP generation. The Coaching Module extends this by making GROW the conversational framework for every session, with session notes tagged to GROW phases and AI-generated session prep aligned to the model.</w:t>
+        <w:t>ARTES already implements GROW as the backbone of IDP generation. The Coaching Module extends this by making GROW the conversational framework for every session, with session notes tagged to GROW phases and AI-generated session prep aligned to the model.</w:t>
       </w:r>
     </w:p>
     <w:p>
@@ -1381,10 +1391,7 @@
     <w:p/>
     <w:p>
       <w:r>
-        <w:t>ARTES</w:t>
-      </w:r>
-      <w:r>
-        <w:t>'s Coaching Module should allow coaches to tag sessions with the framework(s) used. This supports professional development reflection and ICF competency demonstration.</w:t>
+        <w:t>ARTES's Coaching Module should allow coaches to tag sessions with the framework(s) used. This supports professional development reflection and ICF competency demonstration.</w:t>
       </w:r>
     </w:p>
     <w:p>
@@ -1474,13 +1481,7 @@
               <w:rPr>
                 <w:sz w:val="20"/>
               </w:rPr>
-              <w:t>ARTES</w:t>
-            </w:r>
-            <w:r>
-              <w:rPr>
-                <w:sz w:val="20"/>
-              </w:rPr>
-              <w:t xml:space="preserve"> Integration</w:t>
+              <w:t>ARTES Integration</w:t>
             </w:r>
           </w:p>
         </w:tc>
@@ -2323,10 +2324,7 @@
         <w:ind w:left="720"/>
       </w:pPr>
       <w:r>
-        <w:t>ARTES</w:t>
-      </w:r>
-      <w:r>
-        <w:t xml:space="preserve"> feature: Prospect status on engagement record; optional notes from chemistry call</w:t>
+        <w:t>ARTES feature: Prospect status on engagement record; optional notes from chemistry call</w:t>
       </w:r>
     </w:p>
     <w:p>
@@ -2401,10 +2399,7 @@
         <w:ind w:left="720"/>
       </w:pPr>
       <w:r>
-        <w:t>ARTES</w:t>
-      </w:r>
-      <w:r>
-        <w:t xml:space="preserve"> features: Engagement record creation, sponsor contact info, session package tracking, document upload for signed contracts</w:t>
+        <w:t>ARTES features: Engagement record creation, sponsor contact info, session package tracking, document upload for signed contracts</w:t>
       </w:r>
     </w:p>
     <w:p>
@@ -2463,16 +2458,7 @@
         <w:ind w:left="720"/>
       </w:pPr>
       <w:r>
-        <w:t>ARTES</w:t>
-      </w:r>
-      <w:r>
-        <w:t xml:space="preserve"> features: AssessmentRecord storage, </w:t>
-      </w:r>
-      <w:r>
-        <w:t>ARTES</w:t>
-      </w:r>
-      <w:r>
-        <w:t xml:space="preserve"> survey engine for 360/intake, link to existing coach interview flow</w:t>
+        <w:t>ARTES features: AssessmentRecord storage, ARTES survey engine for 360/intake, link to existing coach interview flow</w:t>
       </w:r>
     </w:p>
     <w:p>
@@ -2512,10 +2498,7 @@
         <w:ind w:left="720"/>
       </w:pPr>
       <w:r>
-        <w:t>ARTES</w:t>
-      </w:r>
-      <w:r>
-        <w:t xml:space="preserve"> feature: Existing AI-powered IDP generation with GROW model — already built</w:t>
+        <w:t>ARTES feature: Existing AI-powered IDP generation with GROW model — already built</w:t>
       </w:r>
     </w:p>
     <w:p>
@@ -2564,10 +2547,7 @@
         <w:ind w:left="720"/>
       </w:pPr>
       <w:r>
-        <w:t>ARTES</w:t>
-      </w:r>
-      <w:r>
-        <w:t xml:space="preserve"> features: Session model (detailed in Section 4), action item tracking, reflection journal, AI session prep</w:t>
+        <w:t>ARTES features: Session model (detailed in Section 4), action item tracking, reflection journal, AI session prep</w:t>
       </w:r>
     </w:p>
     <w:p>
@@ -2616,10 +2596,7 @@
         <w:ind w:left="720"/>
       </w:pPr>
       <w:r>
-        <w:t>ARTES</w:t>
-      </w:r>
-      <w:r>
-        <w:t xml:space="preserve"> feature: AI-drafted sponsor report from session data, manual review/edit before sharing</w:t>
+        <w:t>ARTES feature: AI-drafted sponsor report from session data, manual review/edit before sharing</w:t>
       </w:r>
     </w:p>
     <w:p>
@@ -2678,10 +2655,7 @@
         <w:ind w:left="720"/>
       </w:pPr>
       <w:r>
-        <w:t>ARTES</w:t>
-      </w:r>
-      <w:r>
-        <w:t xml:space="preserve"> features: Pre/post assessment comparison, AI-generated final report, engagement status -&gt; Completed</w:t>
+        <w:t>ARTES features: Pre/post assessment comparison, AI-generated final report, engagement status -&gt; Completed</w:t>
       </w:r>
     </w:p>
     <w:p>
@@ -4822,10 +4796,7 @@
     </w:p>
     <w:p>
       <w:r>
-        <w:t>ARTES</w:t>
-      </w:r>
-      <w:r>
-        <w:t>'s existing Claude API integration (ai.service.ts with callClaude, 3-retry backoff, structured JSON output) serves as the foundation for coaching-specific AI features.</w:t>
+        <w:t>ARTES's existing Claude API integration (ai.service.ts with callClaude, 3-retry backoff, structured JSON output) serves as the foundation for coaching-specific AI features.</w:t>
       </w:r>
     </w:p>
     <w:tbl>
@@ -11916,13 +11887,7 @@
               <w:rPr>
                 <w:sz w:val="20"/>
               </w:rPr>
-              <w:t>ARTES</w:t>
-            </w:r>
-            <w:r>
-              <w:rPr>
-                <w:sz w:val="20"/>
-              </w:rPr>
-              <w:t xml:space="preserve"> Module</w:t>
+              <w:t>ARTES Module</w:t>
             </w:r>
           </w:p>
         </w:tc>
@@ -13157,7 +13122,683 @@
         <w:pStyle w:val="Heading1"/>
       </w:pPr>
       <w:r>
-        <w:t>14. Appendix: Canadian Tax Considerations for Coaching Services</w:t>
+        <w:t>14. Implementation Status (April 2026)</w:t>
+      </w:r>
+    </w:p>
+    <w:p>
+      <w:pPr/>
+      <w:r>
+        <w:t>The Coaching Module has been implemented iteratively over several release cycles. This section records what is live in production as of April 2026, so this document serves as both specification and state-of-build reference. Sections 3 through 12 describe the designed behaviour; the sub-sections below note which of those items are fully delivered, which are partial, and which are still outstanding.</w:t>
+      </w:r>
+    </w:p>
+    <w:p>
+      <w:pPr>
+        <w:pStyle w:val="Heading2"/>
+      </w:pPr>
+      <w:r>
+        <w:t>14.1 Data Models (Live)</w:t>
+      </w:r>
+    </w:p>
+    <w:p>
+      <w:pPr>
+        <w:pStyle w:val="ListBullet"/>
+      </w:pPr>
+      <w:r>
+        <w:t>CoachingEngagement: coachId, coacheeId, sponsorId, billingMode ("sponsor" | "subscription"), status (prospect / contracted / active / paused / completed), sessionQuota, notes.</w:t>
+      </w:r>
+    </w:p>
+    <w:p>
+      <w:pPr>
+        <w:pStyle w:val="ListBullet"/>
+      </w:pPr>
+      <w:r>
+        <w:t>CoachingSession: engagementId, coacheeId, date, duration, format, status (scheduled / completed / cancelled), bookingId (paired Booking record), createdVia ("coach" | "coachee_booking"), per-session rate override.</w:t>
+      </w:r>
+    </w:p>
+    <w:p>
+      <w:pPr>
+        <w:pStyle w:val="ListBullet"/>
+      </w:pPr>
+      <w:r>
+        <w:t>Sponsor (new entity replacing free-text engagement fields): name, email (unique per org), billingAddress (structured line1/line2/city/state/postalCode/country), taxId, taxExempt, defaultHourlyRate, optional coacheeId (self-pay marker).</w:t>
+      </w:r>
+    </w:p>
+    <w:p>
+      <w:pPr>
+        <w:pStyle w:val="ListBullet"/>
+      </w:pPr>
+      <w:r>
+        <w:t>Invoice: unified model supporting both org-subscription (INV-) and sponsor (SPN-) invoices; carries sponsorId and engagementIds to prevent double-billing.</w:t>
+      </w:r>
+    </w:p>
+    <w:p>
+      <w:pPr>
+        <w:pStyle w:val="ListBullet"/>
+      </w:pPr>
+      <w:r>
+        <w:t>JournalSessionNote: split ownership - preSession / inSession / postSession fields are coach-owned; coacheePre (moodRating 1-5 stars, topOfMind, mainTopic, valueDefinition, recentShifts, contextForCoach) and coacheePost (biggestInsight, whatShifted, three commitments, followThroughConfidence 1-10, sessionRating 1-5, exploreNext, feedbackForCoach) are coachee-owned.</w:t>
+      </w:r>
+    </w:p>
+    <w:p>
+      <w:pPr>
+        <w:pStyle w:val="ListBullet"/>
+      </w:pPr>
+      <w:r>
+        <w:t>AI fields on the journal: aiSummary, aiThemes, aiGeneratedAt on each note; plus engagement-level insights (recurringThemes, growthArc, coachObservations, openThreads, suggestedNextFocus).</w:t>
+      </w:r>
+    </w:p>
+    <w:p>
+      <w:pPr>
+        <w:pStyle w:val="ListBullet"/>
+      </w:pPr>
+      <w:r>
+        <w:t>User extensions: bio, publicSlug (sparse unique), sponsorId.</w:t>
+      </w:r>
+    </w:p>
+    <w:p>
+      <w:pPr>
+        <w:pStyle w:val="ListBullet"/>
+      </w:pPr>
+      <w:r>
+        <w:t>Organization extensions: previousPlan, previousModules, previousMaxUsers (trial snapshot).</w:t>
+      </w:r>
+    </w:p>
+    <w:p>
+      <w:pPr>
+        <w:pStyle w:val="ListBullet"/>
+      </w:pPr>
+      <w:r>
+        <w:t>Booking, BookingEventType, BookingSettings, WebhookState - full booking stack with Google Calendar integration.</w:t>
+      </w:r>
+    </w:p>
+    <w:p>
+      <w:pPr>
+        <w:pStyle w:val="Heading2"/>
+      </w:pPr>
+      <w:r>
+        <w:t>14.2 Session Journal (Live)</w:t>
+      </w:r>
+    </w:p>
+    <w:p>
+      <w:pPr>
+        <w:pStyle w:val="ListBullet"/>
+      </w:pPr>
+      <w:r>
+        <w:t>Coach can draft structured pre-session prep, in-session observations and notable quotes, and post-session reflection with accountability items. The editor strips coachee-owned sections from the coach view.</w:t>
+      </w:r>
+    </w:p>
+    <w:p>
+      <w:pPr>
+        <w:pStyle w:val="ListBullet"/>
+      </w:pPr>
+      <w:r>
+        <w:t>Coachee fills a pre-session check-in (star rating + prep prompts) and a post-session reflection with three commitments, confidence slider and session rating. Post tab is gated until the session status is completed.</w:t>
+      </w:r>
+    </w:p>
+    <w:p>
+      <w:pPr>
+        <w:pStyle w:val="ListBullet"/>
+      </w:pPr>
+      <w:r>
+        <w:t>Claude generates per-note summaries and cross-session "engagement insights" (themes, growth arc, open threads, suggested next focus). Generate/Regenerate buttons gated by note count (&gt;= 2 for insights).</w:t>
+      </w:r>
+    </w:p>
+    <w:p>
+      <w:pPr>
+        <w:pStyle w:val="ListBullet"/>
+      </w:pPr>
+      <w:r>
+        <w:t>Role-based write permissions enforced in journal.routes.ts: coachee can only write coacheePre/coacheePost subdocuments; attempts to submit coach fields are stripped.</w:t>
+      </w:r>
+    </w:p>
+    <w:p>
+      <w:pPr>
+        <w:pStyle w:val="Heading2"/>
+      </w:pPr>
+      <w:r>
+        <w:t>14.3 Booking Module (Live)</w:t>
+      </w:r>
+    </w:p>
+    <w:p>
+      <w:pPr>
+        <w:pStyle w:val="ListBullet"/>
+      </w:pPr>
+      <w:r>
+        <w:t>Event types with per-type duration, buffers, availability window, and payment flag.</w:t>
+      </w:r>
+    </w:p>
+    <w:p>
+      <w:pPr>
+        <w:pStyle w:val="ListBullet"/>
+      </w:pPr>
+      <w:r>
+        <w:t>Public coach landing at /c/:slug with book flow in a modal overlay; authenticated coachees get their fields pre-filled.</w:t>
+      </w:r>
+    </w:p>
+    <w:p>
+      <w:pPr>
+        <w:pStyle w:val="ListBullet"/>
+      </w:pPr>
+      <w:r>
+        <w:t>Google Calendar two-way sync: freebusy conflict check includes targetCalendarId plus declared conflictCalendarIds (deduped). System-to-GCal for create / cancel / admin reschedule; GCal-to-system for cancel / decline / reschedule on the coach calendar.</w:t>
+      </w:r>
+    </w:p>
+    <w:p>
+      <w:pPr>
+        <w:pStyle w:val="ListBullet"/>
+      </w:pPr>
+      <w:r>
+        <w:t>Push-notification channels (events.watch) are registered on calendar select, renewed hourly when within 2 days of expiry, and stopped on disconnect. Webhook endpoint at POST /api/webhooks/gcal validates X-Goog headers plus optional token. Behaviour is gated by BOOKING_WEBHOOKS_ENABLED.</w:t>
+      </w:r>
+    </w:p>
+    <w:p>
+      <w:pPr>
+        <w:pStyle w:val="ListBullet"/>
+      </w:pPr>
+      <w:r>
+        <w:t>rescheduleHistory on Booking records every change with actor attribution (admin / coach_gcal).</w:t>
+      </w:r>
+    </w:p>
+    <w:p>
+      <w:pPr>
+        <w:pStyle w:val="ListBullet"/>
+      </w:pPr>
+      <w:r>
+        <w:t>Cancel is idempotent: tolerates missing googleEventId, swallows GCal 404/410, always updates Mongo state.</w:t>
+      </w:r>
+    </w:p>
+    <w:p>
+      <w:pPr>
+        <w:pStyle w:val="ListBullet"/>
+      </w:pPr>
+      <w:r>
+        <w:t>Reminder cron filters startTime &gt;= now at the Mongo layer with a per-loop defensive guard.</w:t>
+      </w:r>
+    </w:p>
+    <w:p>
+      <w:pPr>
+        <w:pStyle w:val="Heading2"/>
+      </w:pPr>
+      <w:r>
+        <w:t>14.4 Booking &lt;-&gt; Coaching Integration (Live)</w:t>
+      </w:r>
+    </w:p>
+    <w:p>
+      <w:pPr>
+        <w:pStyle w:val="ListBullet"/>
+      </w:pPr>
+      <w:r>
+        <w:t>Bidirectional sync lives in bookingCoachingSync.service.ts to avoid circular imports.</w:t>
+      </w:r>
+    </w:p>
+    <w:p>
+      <w:pPr>
+        <w:pStyle w:val="ListBullet"/>
+      </w:pPr>
+      <w:r>
+        <w:t>Authenticated coachee books via public flow -&gt; linkBookingToCoaching finds or creates an active CoachingEngagement (matched by coacheeId or email) and creates a paired CoachingSession.</w:t>
+      </w:r>
+    </w:p>
+    <w:p>
+      <w:pPr>
+        <w:pStyle w:val="ListBullet"/>
+      </w:pPr>
+      <w:r>
+        <w:t>Coach creates a session -&gt; mirrorSessionToBooking creates the GCal-owning Booking.</w:t>
+      </w:r>
+    </w:p>
+    <w:p>
+      <w:pPr>
+        <w:pStyle w:val="ListBullet"/>
+      </w:pPr>
+      <w:r>
+        <w:t>Cancel and reschedule propagate in both directions. Whichever side created the record owns the GCal event; the webhook diff path finds the Booking by googleEventId and propagates from there.</w:t>
+      </w:r>
+    </w:p>
+    <w:p>
+      <w:pPr>
+        <w:pStyle w:val="ListBullet"/>
+      </w:pPr>
+      <w:r>
+        <w:t>Session quota enforcement via precheckBookingQuota.</w:t>
+      </w:r>
+    </w:p>
+    <w:p>
+      <w:pPr>
+        <w:pStyle w:val="Heading2"/>
+      </w:pPr>
+      <w:r>
+        <w:t>14.5 Sponsor Billing (Live)</w:t>
+      </w:r>
+    </w:p>
+    <w:p>
+      <w:pPr>
+        <w:pStyle w:val="ListBullet"/>
+      </w:pPr>
+      <w:r>
+        <w:t>Sponsor list with card grid and "View billing" shortcut.</w:t>
+      </w:r>
+    </w:p>
+    <w:p>
+      <w:pPr>
+        <w:pStyle w:val="ListBullet"/>
+      </w:pPr>
+      <w:r>
+        <w:t>Sponsor billing page aggregates all engagements for all coachees belonging to that sponsor, with a "Pending invoicing" current-month estimate and a full invoice history.</w:t>
+      </w:r>
+    </w:p>
+    <w:p>
+      <w:pPr>
+        <w:pStyle w:val="ListBullet"/>
+      </w:pPr>
+      <w:r>
+        <w:t>Generate Invoice endpoint: skips engagements already billed, uses SPN-YYYY-NNNN numbering with a duplicate-retry loop, applies Canadian tax from the sponsor billing address (GST / HST / PST / QST via tax-rates.ts).</w:t>
+      </w:r>
+    </w:p>
+    <w:p>
+      <w:pPr>
+        <w:pStyle w:val="ListBullet"/>
+      </w:pPr>
+      <w:r>
+        <w:t>View (A4 print-ready) / Edit (line-item editor with live totals) / Send / Void / Delete actions, all role-gated.</w:t>
+      </w:r>
+    </w:p>
+    <w:p>
+      <w:pPr>
+        <w:pStyle w:val="ListBullet"/>
+      </w:pPr>
+      <w:r>
+        <w:t>Sponsor invoices are filtered out of the org subscription billing views on both org-level and system-admin-level invoice listings.</w:t>
+      </w:r>
+    </w:p>
+    <w:p>
+      <w:pPr>
+        <w:pStyle w:val="Heading2"/>
+      </w:pPr>
+      <w:r>
+        <w:t>14.6 Coachee Portal (Live)</w:t>
+      </w:r>
+    </w:p>
+    <w:p>
+      <w:pPr>
+        <w:pStyle w:val="ListBullet"/>
+      </w:pPr>
+      <w:r>
+        <w:t>Sidebar auto-flattens single-child nav groups: coachees see "Engagements" as a top-level item.</w:t>
+      </w:r>
+    </w:p>
+    <w:p>
+      <w:pPr>
+        <w:pStyle w:val="ListBullet"/>
+      </w:pPr>
+      <w:r>
+        <w:t>Coachee dashboard reuses the coaching-dashboard component with an independent data path (no Promise.all coupling with coach-only queries). Stats row loads dashboard and sessions in parallel.</w:t>
+      </w:r>
+    </w:p>
+    <w:p>
+      <w:pPr>
+        <w:pStyle w:val="ListBullet"/>
+      </w:pPr>
+      <w:r>
+        <w:t>Engagement detail page branches by role: coachees see a + tile for "Book a Session", coach sees + tile for "New Session". Both see the journal panel.</w:t>
+      </w:r>
+    </w:p>
+    <w:p>
+      <w:pPr>
+        <w:pStyle w:val="ListBullet"/>
+      </w:pPr>
+      <w:r>
+        <w:t>Public booking form pre-fills firstName / lastName / email from the authenticated coachee when available.</w:t>
+      </w:r>
+    </w:p>
+    <w:p>
+      <w:pPr>
+        <w:pStyle w:val="Heading2"/>
+      </w:pPr>
+      <w:r>
+        <w:t>14.7 Practice &amp; Admin Surface (Live)</w:t>
+      </w:r>
+    </w:p>
+    <w:p>
+      <w:pPr>
+        <w:pStyle w:val="ListBullet"/>
+      </w:pPr>
+      <w:r>
+        <w:t>Coach interview flow: template -&gt; setup (individual / team / group, target name, optional coachee) -&gt; questions -&gt; submit, via POST /api/surveys/respond.</w:t>
+      </w:r>
+    </w:p>
+    <w:p>
+      <w:pPr>
+        <w:pStyle w:val="ListBullet"/>
+      </w:pPr>
+      <w:r>
+        <w:t>Role-scoped reads on the coaching module: coach sees own engagements, admin and hr_manager see the whole org, coachee sees their own.</w:t>
+      </w:r>
+    </w:p>
+    <w:p>
+      <w:pPr>
+        <w:pStyle w:val="ListBullet"/>
+      </w:pPr>
+      <w:r>
+        <w:t>Admin user edit dialog has a Sponsor select, populated from the org sponsor list.</w:t>
+      </w:r>
+    </w:p>
+    <w:p>
+      <w:pPr>
+        <w:pStyle w:val="ListBullet"/>
+      </w:pPr>
+      <w:r>
+        <w:t>System-admin per-org trial feature: snapshot current plan / modules / maxUsers, apply trial values, auto-revert via nightly 02:15 cron. Org-settings page surfaces trial-granted modules that sit outside the base plan so the org admin can still toggle them.</w:t>
+      </w:r>
+    </w:p>
+    <w:p>
+      <w:pPr>
+        <w:pStyle w:val="Heading2"/>
+      </w:pPr>
+      <w:r>
+        <w:t>14.8 AI &amp; Tax Infrastructure (Live)</w:t>
+      </w:r>
+    </w:p>
+    <w:p>
+      <w:pPr>
+        <w:pStyle w:val="ListBullet"/>
+      </w:pPr>
+      <w:r>
+        <w:t>Claude prompts used in the coaching module: journal note summary, cross-session engagement insights, IDP generation (existing from succession). All follow the ai.service.ts pattern with three-retry backoff and JSON-only responses.</w:t>
+      </w:r>
+    </w:p>
+    <w:p>
+      <w:pPr>
+        <w:pStyle w:val="ListBullet"/>
+      </w:pPr>
+      <w:r>
+        <w:t>Canadian tax engine in backend/src/config/tax-rates.ts covers all ten provinces and three territories with GST / HST / PST / QST components; taxExempt flag on sponsor and organization skips tax entirely.</w:t>
+      </w:r>
+    </w:p>
+    <w:p>
+      <w:pPr>
+        <w:pStyle w:val="Heading2"/>
+      </w:pPr>
+      <w:r>
+        <w:t>14.9 Testing (Live)</w:t>
+      </w:r>
+    </w:p>
+    <w:p>
+      <w:pPr>
+        <w:pStyle w:val="ListBullet"/>
+      </w:pPr>
+      <w:r>
+        <w:t>Jest + ts-jest + mongodb-memory-server harness at backend/tests/.</w:t>
+      </w:r>
+    </w:p>
+    <w:p>
+      <w:pPr>
+        <w:pStyle w:val="ListBullet"/>
+      </w:pPr>
+      <w:r>
+        <w:t>20 passing integration tests across 8 sync behaviours (GCal cancel / decline / reschedule / add-free-event inbound, system-side create / cancel / reschedule outbound, plus the booking-coaching link path).</w:t>
+      </w:r>
+    </w:p>
+    <w:p>
+      <w:pPr>
+        <w:pStyle w:val="ListBullet"/>
+      </w:pPr>
+      <w:r>
+        <w:t>googleapis and SES are mocked; MongoDB is real in-memory for full tenant plugin coverage. `npm test` from /backend runs the full suite in ~40s.</w:t>
+      </w:r>
+    </w:p>
+    <w:p>
+      <w:pPr>
+        <w:pStyle w:val="Heading1"/>
+      </w:pPr>
+      <w:r>
+        <w:t>15. Outstanding Work &amp; Roadmap Gaps</w:t>
+      </w:r>
+    </w:p>
+    <w:p>
+      <w:pPr/>
+      <w:r>
+        <w:t>The following items are designed in sections 3-12 of this document but not yet implemented. They are listed in rough priority order, grouped by theme.</w:t>
+      </w:r>
+    </w:p>
+    <w:p>
+      <w:pPr>
+        <w:pStyle w:val="Heading2"/>
+      </w:pPr>
+      <w:r>
+        <w:t>15.1 Assessments &amp; Measurement</w:t>
+      </w:r>
+    </w:p>
+    <w:p>
+      <w:pPr>
+        <w:pStyle w:val="ListBullet"/>
+      </w:pPr>
+      <w:r>
+        <w:t>Generic AssessmentRecord model (type, date, scores JSON, PDF attachment, coach interpretation). Required to store EQ-i / DISC / Hogan / Leadership Circle results outside of the survey engine.</w:t>
+      </w:r>
+    </w:p>
+    <w:p>
+      <w:pPr>
+        <w:pStyle w:val="ListBullet"/>
+      </w:pPr>
+      <w:r>
+        <w:t>Pre / post assessment comparison view on the engagement detail page, with score deltas per dimension.</w:t>
+      </w:r>
+    </w:p>
+    <w:p>
+      <w:pPr>
+        <w:pStyle w:val="ListBullet"/>
+      </w:pPr>
+      <w:r>
+        <w:t>Formal 360-feedback flow on top of the survey engine: rater categories (self, manager, peer, direct report), aggregated multi-rater report, link back to IDP goal setting.</w:t>
+      </w:r>
+    </w:p>
+    <w:p>
+      <w:pPr>
+        <w:pStyle w:val="Heading2"/>
+      </w:pPr>
+      <w:r>
+        <w:t>15.2 ICF Credentialing</w:t>
+      </w:r>
+    </w:p>
+    <w:p>
+      <w:pPr>
+        <w:pStyle w:val="ListBullet"/>
+      </w:pPr>
+      <w:r>
+        <w:t>CoachingHoursLog: auto-populate from completed sessions (paid / pro bono, individual / team / group), manual entry for external clients, mentor-coaching hours received, CCE credit logging.</w:t>
+      </w:r>
+    </w:p>
+    <w:p>
+      <w:pPr>
+        <w:pStyle w:val="ListBullet"/>
+      </w:pPr>
+      <w:r>
+        <w:t>"Running totals" dashboard ("347 of 500 hours towards PCC") and ICF-export-ready format.</w:t>
+      </w:r>
+    </w:p>
+    <w:p>
+      <w:pPr>
+        <w:pStyle w:val="Heading2"/>
+      </w:pPr>
+      <w:r>
+        <w:t>15.3 Sponsor &amp; Engagement Reporting</w:t>
+      </w:r>
+    </w:p>
+    <w:p>
+      <w:pPr>
+        <w:pStyle w:val="ListBullet"/>
+      </w:pPr>
+      <w:r>
+        <w:t>AI-drafted sponsor progress report pulling from session data and milestone status, with granular coach review controls before sharing. Must guarantee private session content never leaks.</w:t>
+      </w:r>
+    </w:p>
+    <w:p>
+      <w:pPr>
+        <w:pStyle w:val="ListBullet"/>
+      </w:pPr>
+      <w:r>
+        <w:t>Final engagement closure report (goals, pre/post deltas, transition plan, recommendations).</w:t>
+      </w:r>
+    </w:p>
+    <w:p>
+      <w:pPr>
+        <w:pStyle w:val="ListBullet"/>
+      </w:pPr>
+      <w:r>
+        <w:t>ROI dashboard: goal achievement rate, pre/post deltas, coachee and sponsor satisfaction scores.</w:t>
+      </w:r>
+    </w:p>
+    <w:p>
+      <w:pPr>
+        <w:pStyle w:val="ListBullet"/>
+      </w:pPr>
+      <w:r>
+        <w:t>Optional sponsor portal with limited read-only access to pre-agreed metrics.</w:t>
+      </w:r>
+    </w:p>
+    <w:p>
+      <w:pPr>
+        <w:pStyle w:val="Heading2"/>
+      </w:pPr>
+      <w:r>
+        <w:t>15.4 Between-Session Engagement</w:t>
+      </w:r>
+    </w:p>
+    <w:p>
+      <w:pPr>
+        <w:pStyle w:val="ListBullet"/>
+      </w:pPr>
+      <w:r>
+        <w:t>Check-in pulse micro-surveys (2-3 questions, configurable cadence) feeding into the coach session-prep brief.</w:t>
+      </w:r>
+    </w:p>
+    <w:p>
+      <w:pPr>
+        <w:pStyle w:val="ListBullet"/>
+      </w:pPr>
+      <w:r>
+        <w:t>AI-generated reflection prompts personalised to current goals and recent session content (beyond the static pre-session template).</w:t>
+      </w:r>
+    </w:p>
+    <w:p>
+      <w:pPr>
+        <w:pStyle w:val="ListBullet"/>
+      </w:pPr>
+      <w:r>
+        <w:t>Dedicated ActionItem entity with Not-Started / In-Progress / Complete / Deferred lifecycle, overdue reminders, and a cross-engagement action board for the coach. Currently only accountability items on each journal note.</w:t>
+      </w:r>
+    </w:p>
+    <w:p>
+      <w:pPr>
+        <w:pStyle w:val="ListBullet"/>
+      </w:pPr>
+      <w:r>
+        <w:t>AI coach session-prep brief: 60-second summary of prior notes, outstanding action items, check-in data for the upcoming session.</w:t>
+      </w:r>
+    </w:p>
+    <w:p>
+      <w:pPr>
+        <w:pStyle w:val="Heading2"/>
+      </w:pPr>
+      <w:r>
+        <w:t>15.5 Engagement Lifecycle Coverage</w:t>
+      </w:r>
+    </w:p>
+    <w:p>
+      <w:pPr>
+        <w:pStyle w:val="ListBullet"/>
+      </w:pPr>
+      <w:r>
+        <w:t>Chemistry call workflow distinct from paid sessions (complimentary, no quota consumption, prospect -&gt; contracted transition).</w:t>
+      </w:r>
+    </w:p>
+    <w:p>
+      <w:pPr>
+        <w:pStyle w:val="ListBullet"/>
+      </w:pPr>
+      <w:r>
+        <w:t>Contract upload and e-signature integration on the contracting phase.</w:t>
+      </w:r>
+    </w:p>
+    <w:p>
+      <w:pPr>
+        <w:pStyle w:val="ListBullet"/>
+      </w:pPr>
+      <w:r>
+        <w:t>Mid-point and final three-way review scheduling and templates.</w:t>
+      </w:r>
+    </w:p>
+    <w:p>
+      <w:pPr>
+        <w:pStyle w:val="ListBullet"/>
+      </w:pPr>
+      <w:r>
+        <w:t>Alumni follow-up automation: 3-month / 6-month reminders, alumni read-only access to their IDP and session summaries, reactivation workflow.</w:t>
+      </w:r>
+    </w:p>
+    <w:p>
+      <w:pPr>
+        <w:pStyle w:val="Heading2"/>
+      </w:pPr>
+      <w:r>
+        <w:t>15.6 Theory &amp; Framework Metadata</w:t>
+      </w:r>
+    </w:p>
+    <w:p>
+      <w:pPr>
+        <w:pStyle w:val="ListBullet"/>
+      </w:pPr>
+      <w:r>
+        <w:t>Session framework tagging (GROW, CBT, positive psychology, solution-focused, narrative) as an aid for professional development reflection and ICF competency demonstration.</w:t>
+      </w:r>
+    </w:p>
+    <w:p>
+      <w:pPr>
+        <w:pStyle w:val="ListBullet"/>
+      </w:pPr>
+      <w:r>
+        <w:t>ICF competency self-rating prompts on session notes.</w:t>
+      </w:r>
+    </w:p>
+    <w:p>
+      <w:pPr>
+        <w:pStyle w:val="Heading2"/>
+      </w:pPr>
+      <w:r>
+        <w:t>15.7 Practice Management Polish</w:t>
+      </w:r>
+    </w:p>
+    <w:p>
+      <w:pPr>
+        <w:pStyle w:val="ListBullet"/>
+      </w:pPr>
+      <w:r>
+        <w:t>Session package management: purchased vs used vs remaining with low-balance alerts (quota exists per engagement; package renewal workflow not yet built).</w:t>
+      </w:r>
+    </w:p>
+    <w:p>
+      <w:pPr>
+        <w:pStyle w:val="ListBullet"/>
+      </w:pPr>
+      <w:r>
+        <w:t>Practice-level dashboard: revenue this quarter, upcoming sessions calendar view across all engagements, "clients with no session in 3+ weeks" health indicator.</w:t>
+      </w:r>
+    </w:p>
+    <w:p>
+      <w:pPr>
+        <w:pStyle w:val="ListBullet"/>
+      </w:pPr>
+      <w:r>
+        <w:t>Coach branding: publicSlug and bio exist; a richer public-profile template (photo, testimonials, service list, book-now CTA) is outstanding.</w:t>
+      </w:r>
+    </w:p>
+    <w:p>
+      <w:pPr>
+        <w:pStyle w:val="Heading1"/>
+      </w:pPr>
+      <w:r>
+        <w:t>16. Appendix: Canadian Tax Considerations for Coaching Services</w:t>
       </w:r>
     </w:p>
     <w:p>
@@ -13222,10 +13863,7 @@
         <w:ind w:left="720"/>
       </w:pPr>
       <w:r>
-        <w:t>ARTES</w:t>
-      </w:r>
-      <w:r>
-        <w:t xml:space="preserve"> auto-calculates Canadian tax from organization billing address province (see tax-rates.ts)</w:t>
+        <w:t>ARTES auto-calculates Canadian tax from organization billing address province (see tax-rates.ts)</w:t>
       </w:r>
     </w:p>
     <w:p/>

</xml_diff>